<commit_message>
Documentação e coisas mais
Atualização no arquivo que descreve a arquitetura e na documentação do projeto de pesquisa.
Commit e era isso!
</commit_message>
<xml_diff>
--- a/docs/Projeto de pesquisa - Final.docx
+++ b/docs/Projeto de pesquisa - Final.docx
@@ -16503,6 +16503,77 @@
     <w:p>
       <w:pPr>
         <w:pStyle w:val="Ttulo1"/>
+      </w:pPr>
+      <w:r>
+        <w:t>Desenvolvimento e evolução do projeto – atualização de implementação</w:t>
+      </w:r>
+    </w:p>
+    <w:p>
+      <w:pPr/>
+      <w:r>
+        <w:t>As seções anteriores descrevem a concepção inicial do projeto. Durante a fase de implementação e testes de bancada, decisões de engenharia levaram a uma evolução significativa da arquitetura, documentada a seguir com as respectivas justificativas. Todo o desenvolvimento encontra-se versionado em repositório público (https://github.com/MatheusNespolo/DataFlowInventory), acompanhado de documentação técnica: arquitetura de comunicação MQTT, fluxogramas de funcionamento (FSM e ciclo de um pedido), guia de configuração do broker local e plano de testes.</w:t>
+      </w:r>
+    </w:p>
+    <w:p>
+      <w:pPr/>
+      <w:r>
+        <w:t>a) Substituição do Arduino Mega pelo Arduino Uno. A troca do driver de motores L298N (que exige três pinos por motor: ENA, IN1 e IN2) por quatro módulos MOSFET IRF520 (um único pino PWM por motor) reduziu a demanda de E/S de doze para quatro pinos de controle de motores. Como os motores DC 3–6 V das esteiras operam em sentido único, a ponte H completa do L298N era desnecessária; além disso, a queda de tensão interna do L298N (aproximadamente 2 V) é crítica para motores de baixa tensão, problema eliminado pelo acionamento por MOSFET. Com a redução de pinos, o Arduino Uno tornou-se suficiente, reduzindo o custo do protótipo e reforçando o objetivo de viabilidade econômica do projeto.</w:t>
+      </w:r>
+    </w:p>
+    <w:p>
+      <w:pPr/>
+      <w:r>
+        <w:t>b) Remoção dos botões físicos e controle exclusivo via dashboard. Os quatro botões físicos previstos inicialmente foram desabilitados, e a solicitação de peças passou a ser feita exclusivamente pela interface web. A mudança elimina hardware redundante e, principalmente, demonstra na prática o objetivo central do projeto: o controle remoto do processo de intralogística por meio de tecnologias IoT.</w:t>
+      </w:r>
+    </w:p>
+    <w:p>
+      <w:pPr/>
+      <w:r>
+        <w:t>c) Protocolo de comunicação serial em JSON. O formato inicial de publicação (MQTT|tipo:A|estoqueA:4|...) foi substituído por mensagens JSON estruturadas — por exemplo, {"type":"estoque","pecaA":4,"pecaB":5,"pecaC":5} — interpretadas com a biblioteca ArduinoJson. O campo "type" permite ao gateway rotear cada mensagem para o tópico MQTT correspondente (dataflow/status, dataflow/estoque, dataflow/eventos, dataflow/sensores e dataflow/esteiras), tornando o protocolo robusto ao parsing, extensível e alinhado a práticas consolidadas de integração IoT.</w:t>
+      </w:r>
+    </w:p>
+    <w:p>
+      <w:pPr/>
+      <w:r>
+        <w:t>d) Gateway ESP32 dedicado. O ESP32 atua como ponte Serial–MQTT: recebe as linhas JSON do Arduino Uno pela UART2 (9600 baud, com divisor de tensão 5 V para 3,3 V no sentido Uno–ESP32), publica nos tópicos MQTT e, no sentido inverso, converte comandos recebidos do broker (tópico dataflow/comandos/sub) em instruções textuais para o Arduino (CMD:PECA:A, CMD:RESET). O gateway configura ainda uma mensagem LWT (Last Will and Testament) retida com QoS 1, permitindo que o dashboard detecte em tempo real a queda do hardware (gateway offline) — um ganho direto de confiabilidade, viabilizado pelo próprio protocolo MQTT (OASIS, 2019).</w:t>
+      </w:r>
+    </w:p>
+    <w:p>
+      <w:pPr/>
+      <w:r>
+        <w:t>e) Substituição do Node-RED/Ubidots por servidor Node.js próprio. Em lugar das plataformas de visualização de terceiros consideradas inicialmente, foi desenvolvido um servidor em Node.js (Express + Socket.IO + mqtt.js) que atua como relay entre MQTT e WebSocket (FETTE; MELNIKOV, 2011), servindo um dashboard web em HTML/CSS/JavaScript com diagrama interativo, botões de controle remoto e histórico de eventos. A decisão garante controle total da interface, latência reduzida na atualização em tempo real e independência de planos pagos de plataformas proprietárias — coerente com a proposta de democratização do acesso à automação.</w:t>
+      </w:r>
+    </w:p>
+    <w:p>
+      <w:pPr/>
+      <w:r>
+        <w:t>f) Estratégia dual de broker MQTT. A arquitetura suporta dois modos de operação, selecionáveis por configuração: broker local Eclipse Mosquitto (LIGHT, 2017), na porta 1883 e sem TLS, para desenvolvimento e demonstração em bancada; e broker em nuvem HiveMQ Cloud, na porta 8883, com TLS e autenticação, para o cenário de produção — atendendo ao objetivo de gerenciamento de dados na nuvem com tráfego seguro. A escolha do MQTT como protocolo de transporte fundamenta-se em seu baixo overhead e adequação a dispositivos de recursos restritos, com desempenho superior ao HTTP em cenários IoT (MISHRA; KERTESZ, 2020; NAIK, 2017).</w:t>
+      </w:r>
+    </w:p>
+    <w:p>
+      <w:pPr/>
+      <w:r>
+        <w:t>g) Simulador offline. Foi implementado um simulador em JavaScript que reproduz integralmente a máquina de estados do Arduino, servindo o mesmo dashboard sem necessidade de hardware ou broker. O simulador permitiu desenvolver e validar o front-end em paralelo à montagem física, desacoplando as frentes de trabalho definidas na metodologia (mecânica, elétrica, programação e documentação).</w:t>
+      </w:r>
+    </w:p>
+    <w:p>
+      <w:pPr/>
+      <w:r>
+        <w:t>h) Metodologia de testes incremental. Foi elaborado um plano formal de testes, dividido em três blocos: (i) testes de componentes isolados — B0.1 (setup da placa), B0.2 (sensor IR TCRT5000) e B0.3 (motor DC com IRF520); (ii) testes de bancada integrados — B1 (ciclo completo de entrega), B2 (rejeição por falta de estoque) e B3 (display LCD I2C); e (iii) testes da cadeia de comunicação — Teste 1 (Serial Arduino–ESP32), Teste 2 (ESP32 – broker – Node.js), Teste 3 (comando remoto via cliente MQTT), Teste 4 (End-to-End pelo dashboard) e Teste 5 (FSM completa com duas esteiras, incluindo cenários de rejeição, ocupação e timeout). Cada teste possui materiais, procedimento, critérios de validação e tabela de troubleshooting. O Teste 1 foi executado e aprovado em 12/08/2026, com recepção correta das mensagens JSON pelo ESP32. Uma sonda MQTT em Node.js (mqtt_probe) foi desenvolvida para registrar, com timestamp, todas as mensagens trafegadas nos tópicos do projeto, servindo como evidência experimental para o artigo final.</w:t>
+      </w:r>
+    </w:p>
+    <w:p>
+      <w:pPr/>
+      <w:r>
+        <w:t>i) Trabalhos correlatos não acadêmicos. Complementarmente à revisão bibliográfica, foi realizada uma busca por propostas semelhantes divulgadas em plataformas abertas (YouTube). Foram identificados projetos de esteiras transportadoras com Arduino e ESP8266/ESP32 conectadas a dashboards IoT (vídeos listados nas referências), além de sistemas de classificação de objetos em esteira com monitoramento em nuvem. Nenhuma das propostas encontradas combina, em um único sistema de baixo custo, a máquina de estados determinística no microcontrolador, o gateway MQTT com detecção de queda por LWT, o servidor web próprio com WebSocket e o simulador offline da planta — combinação que constitui o diferencial técnico deste trabalho frente ao estado da técnica informal.</w:t>
+      </w:r>
+    </w:p>
+    <w:p>
+      <w:pPr/>
+    </w:p>
+    <w:p>
+      <w:pPr>
+        <w:pStyle w:val="Ttulo1"/>
         <w:numPr>
           <w:ilvl w:val="0"/>
           <w:numId w:val="17"/>
@@ -16955,6 +17026,18 @@
       </w:r>
     </w:p>
     <w:p>
+      <w:pPr/>
+      <w:r>
+        <w:t>IOT Based Weight Sorting Machine using ESP32 - Automatic Object Sorting System. [S. l.: s. n.], [s. d.]. 1 vídeo. Publicado no YouTube. Disponível em: https://youtu.be/BBhDbL3Bgqo. Acesso em: 14 ago. 2026.</w:t>
+      </w:r>
+    </w:p>
+    <w:p>
+      <w:pPr/>
+      <w:r>
+        <w:t>IOT Managed Inventory - ESP8266, ESP32 - Arduino IDE. [S. l.: s. n.], [s. d.]. 1 vídeo. Publicado no YouTube. Disponível em: https://youtu.be/cR9LL5m40CA. Acesso em: 14 ago. 2026.</w:t>
+      </w:r>
+    </w:p>
+    <w:p>
       <w:pPr>
         <w:spacing w:before="240" w:line="360" w:lineRule="auto"/>
         <w:jc w:val="both"/>
@@ -17532,6 +17615,24 @@
       </w:r>
     </w:p>
     <w:p>
+      <w:pPr/>
+      <w:r>
+        <w:t>FETTE, I.; MELNIKOV, A. The WebSocket Protocol. RFC 6455, Internet Engineering Task Force (IETF), 2011. https://doi.org/10.17487/RFC6455</w:t>
+      </w:r>
+    </w:p>
+    <w:p>
+      <w:pPr/>
+      <w:r>
+        <w:t>ESTEIRA transportadora de peças com Arduino e ESP - IoT - Internet das coisas. [S. l.: s. n.], [s. d.]. 1 vídeo. Publicado no YouTube. Disponível em: https://youtu.be/v3AOj9dW_zQ. Acesso em: 14 ago. 2026.</w:t>
+      </w:r>
+    </w:p>
+    <w:p>
+      <w:pPr/>
+      <w:r>
+        <w:t>ESTEIRA transportadora de peças com Internet das Coisas - Dashboard em tempo real - ESP e Arduino. [S. l.: s. n.], [s. d.]. 1 vídeo. Publicado no YouTube. Disponível em: https://youtu.be/IsJFHfaStQw. Acesso em: 14 ago. 2026.</w:t>
+      </w:r>
+    </w:p>
+    <w:p>
       <w:pPr>
         <w:spacing w:before="240" w:line="360" w:lineRule="auto"/>
         <w:jc w:val="both"/>
@@ -17840,6 +17941,36 @@
           <w:rFonts w:ascii="Arial" w:hAnsi="Arial" w:cs="Arial"/>
         </w:rPr>
         <w:t xml:space="preserve"> Networking Technologies (ATNT), 2024. https://doi.org/10.1109/ATNT61688.2024.10719252</w:t>
+      </w:r>
+    </w:p>
+    <w:p>
+      <w:pPr/>
+      <w:r>
+        <w:t>LIGHT, R. A. Mosquitto: server and client implementation of the MQTT protocol. Journal of Open Source Software, v. 2, n. 13, p. 265, 2017. https://doi.org/10.21105/joss.00265</w:t>
+      </w:r>
+    </w:p>
+    <w:p>
+      <w:pPr/>
+      <w:r>
+        <w:t>MAIER, A.; SHARP, A.; VAGAPOV, Y. Comparative analysis and practical implementation of the ESP32 microcontroller module for the Internet of Things. In: Internet Technologies and Applications (ITA), IEEE, 2017. https://doi.org/10.1109/ITECHA.2017.8101926</w:t>
+      </w:r>
+    </w:p>
+    <w:p>
+      <w:pPr/>
+      <w:r>
+        <w:t>MISHRA, B.; KERTESZ, A. The Use of MQTT in M2M and IoT Systems: A Survey. IEEE Access, v. 8, p. 201071-201086, 2020. https://doi.org/10.1109/ACCESS.2020.3035849</w:t>
+      </w:r>
+    </w:p>
+    <w:p>
+      <w:pPr/>
+      <w:r>
+        <w:t>NAIK, N. Choice of effective messaging protocols for IoT systems: MQTT, CoAP, AMQP and HTTP. In: IEEE International Systems Engineering Symposium (ISSE), 2017. https://doi.org/10.1109/SysEng.2017.8088251</w:t>
+      </w:r>
+    </w:p>
+    <w:p>
+      <w:pPr/>
+      <w:r>
+        <w:t>OASIS. MQTT Version 5.0 - OASIS Standard. Organization for the Advancement of Structured Information Standards, 2019. Disponível em: https://docs.oasis-open.org/mqtt/mqtt/v5.0/mqtt-v5.0.html. Acesso em: 14 ago. 2026.</w:t>
       </w:r>
     </w:p>
     <w:p>

</xml_diff>